<commit_message>
Fix photo export integration and compact appendix layout
</commit_message>
<xml_diff>
--- a/app/assets/templates/bpc-ojt-weekly-journal.v2.docx
+++ b/app/assets/templates/bpc-ojt-weekly-journal.v2.docx
@@ -423,6 +423,10 @@
       </w:r>
     </w:p>
     <w:p>
+      <w:pPr>
+        <w:keepNext/>
+        <w:spacing w:before="120" w:after="60"/>
+      </w:pPr>
       <w:r>
         <w:rPr>
           <w:b/>
@@ -430,26 +434,127 @@
         <w:t>+++$group.dayLabel+++</w:t>
       </w:r>
     </w:p>
-    <w:p>
-      <w:r>
-        <w:t>+++FOR photo IN $group.photos+++</w:t>
-      </w:r>
-    </w:p>
-    <w:p>
-      <w:r>
-        <w:t>+++IMAGE getImage($photo)+++</w:t>
-      </w:r>
-    </w:p>
-    <w:p>
-      <w:r>
-        <w:t>+++$photo.captionDisplay+++</w:t>
-      </w:r>
-    </w:p>
-    <w:p>
-      <w:r>
-        <w:t>+++END-FOR photo+++</w:t>
-      </w:r>
-    </w:p>
+    <w:tbl>
+      <w:tblPr>
+        <w:tblW w:w="8600" w:type="dxa"/>
+        <w:tblLayout w:type="fixed"/>
+        <w:tblCellMar>
+          <w:top w:w="60" w:type="dxa"/>
+          <w:left w:w="60" w:type="dxa"/>
+          <w:bottom w:w="60" w:type="dxa"/>
+          <w:right w:w="60" w:type="dxa"/>
+        </w:tblCellMar>
+        <w:tblBorders>
+          <w:top w:val="nil"/>
+          <w:left w:val="nil"/>
+          <w:bottom w:val="nil"/>
+          <w:right w:val="nil"/>
+          <w:insideH w:val="nil"/>
+          <w:insideV w:val="nil"/>
+        </w:tblBorders>
+      </w:tblPr>
+      <w:tblGrid>
+        <w:gridCol w:w="4300"/>
+        <w:gridCol w:w="4300"/>
+      </w:tblGrid>
+      <w:tr>
+        <w:tc>
+          <w:tcPr>
+            <w:tcW w:w="4300" w:type="dxa"/>
+          </w:tcPr>
+          <w:p>
+            <w:r>
+              <w:t>+++FOR row IN $group.photoRows+++</w:t>
+            </w:r>
+          </w:p>
+        </w:tc>
+        <w:tc>
+          <w:tcPr>
+            <w:tcW w:w="4300" w:type="dxa"/>
+          </w:tcPr>
+          <w:p/>
+        </w:tc>
+      </w:tr>
+      <w:tr>
+        <w:trPr>
+          <w:cantSplit/>
+        </w:trPr>
+        <w:tc>
+          <w:tcPr>
+            <w:tcW w:w="4300" w:type="dxa"/>
+            <w:vAlign w:val="top"/>
+          </w:tcPr>
+          <w:p>
+            <w:pPr>
+              <w:jc w:val="center"/>
+              <w:spacing w:before="0" w:after="0"/>
+            </w:pPr>
+            <w:r>
+              <w:t>+++IMAGE getImage($row.leftPhoto)+++</w:t>
+            </w:r>
+          </w:p>
+          <w:p>
+            <w:pPr>
+              <w:jc w:val="center"/>
+              <w:spacing w:before="0" w:after="80" w:line="200" w:lineRule="auto"/>
+            </w:pPr>
+            <w:r>
+              <w:rPr>
+                <w:sz w:val="18"/>
+              </w:rPr>
+              <w:t>+++$row.leftPhoto.captionDisplay+++</w:t>
+            </w:r>
+          </w:p>
+          <w:p/>
+        </w:tc>
+        <w:tc>
+          <w:tcPr>
+            <w:tcW w:w="4300" w:type="dxa"/>
+            <w:vAlign w:val="top"/>
+          </w:tcPr>
+          <w:p>
+            <w:pPr>
+              <w:jc w:val="center"/>
+              <w:spacing w:before="0" w:after="0"/>
+            </w:pPr>
+            <w:r>
+              <w:t>+++IMAGE getImage($row.rightPhoto)+++</w:t>
+            </w:r>
+          </w:p>
+          <w:p>
+            <w:pPr>
+              <w:jc w:val="center"/>
+              <w:spacing w:before="0" w:after="80" w:line="200" w:lineRule="auto"/>
+            </w:pPr>
+            <w:r>
+              <w:rPr>
+                <w:sz w:val="18"/>
+              </w:rPr>
+              <w:t>+++$row.rightPhoto.captionDisplay+++</w:t>
+            </w:r>
+          </w:p>
+          <w:p/>
+        </w:tc>
+      </w:tr>
+      <w:tr>
+        <w:tc>
+          <w:tcPr>
+            <w:tcW w:w="4300" w:type="dxa"/>
+          </w:tcPr>
+          <w:p>
+            <w:r>
+              <w:t>+++END-FOR row+++</w:t>
+            </w:r>
+          </w:p>
+        </w:tc>
+        <w:tc>
+          <w:tcPr>
+            <w:tcW w:w="4300" w:type="dxa"/>
+          </w:tcPr>
+          <w:p/>
+        </w:tc>
+      </w:tr>
+    </w:tbl>
     <w:p>
       <w:r>
         <w:t>+++END-FOR group+++</w:t>

</xml_diff>

<commit_message>
feat: add dynamic DOCX photo-set layouts
</commit_message>
<xml_diff>
--- a/app/assets/templates/bpc-ojt-weekly-journal.v2.docx
+++ b/app/assets/templates/bpc-ojt-weekly-journal.v2.docx
@@ -434,6 +434,74 @@
         <w:t>+++$group.dayLabel+++</w:t>
       </w:r>
     </w:p>
+    <w:p>
+      <w:r>
+        <w:t xml:space="preserve">+++FOR set IN $group.photoSets+++</w:t>
+      </w:r>
+    </w:p>
+    <w:p>
+      <w:r>
+        <w:t xml:space="preserve">+++IF $set.isSingle+++</w:t>
+      </w:r>
+    </w:p>
+    <w:tbl>
+      <w:tblPr>
+        <w:tblW w:w="8600" w:type="dxa"/>
+        <w:tblLayout w:type="fixed"/>
+        <w:tblCellMar>
+          <w:top w:w="60" w:type="dxa"/>
+          <w:left w:w="60" w:type="dxa"/>
+          <w:bottom w:w="60" w:type="dxa"/>
+          <w:right w:w="60" w:type="dxa"/>
+        </w:tblCellMar>
+        <w:tblBorders>
+          <w:top w:val="nil"/>
+          <w:left w:val="nil"/>
+          <w:bottom w:val="nil"/>
+          <w:right w:val="nil"/>
+          <w:insideH w:val="nil"/>
+          <w:insideV w:val="nil"/>
+        </w:tblBorders>
+      </w:tblPr>
+      <w:tblGrid>
+        <w:gridCol w:w="8600"/>
+      </w:tblGrid>
+      <w:tr>
+        <w:trPr>
+          <w:cantSplit/>
+        </w:trPr>
+        <w:tc>
+          <w:tcPr>
+            <w:tcW w:w="8600" w:type="dxa"/>
+            <w:vAlign w:val="top"/>
+          </w:tcPr>
+          <w:p>
+            <w:pPr>
+              <w:jc w:val="center"/>
+              <w:spacing w:before="0" w:after="0"/>
+            </w:pPr>
+            <w:r>
+              <w:t xml:space="preserve">+++IMAGE getImage($set.singlePhoto)+++</w:t>
+            </w:r>
+          </w:p>
+        </w:tc>
+      </w:tr>
+    </w:tbl>
+    <w:p>
+      <w:r>
+        <w:t xml:space="preserve">+++$set.captionDisplay+++</w:t>
+      </w:r>
+    </w:p>
+    <w:p>
+      <w:r>
+        <w:t xml:space="preserve">+++END-IF+++</w:t>
+      </w:r>
+    </w:p>
+    <w:p>
+      <w:r>
+        <w:t xml:space="preserve">+++IF $set.isDouble+++</w:t>
+      </w:r>
+    </w:p>
     <w:tbl>
       <w:tblPr>
         <w:tblW w:w="8600" w:type="dxa"/>
@@ -458,24 +526,6 @@
         <w:gridCol w:w="4300"/>
       </w:tblGrid>
       <w:tr>
-        <w:tc>
-          <w:tcPr>
-            <w:tcW w:w="4300" w:type="dxa"/>
-          </w:tcPr>
-          <w:p>
-            <w:r>
-              <w:t>+++FOR row IN $group.photoRows+++</w:t>
-            </w:r>
-          </w:p>
-        </w:tc>
-        <w:tc>
-          <w:tcPr>
-            <w:tcW w:w="4300" w:type="dxa"/>
-          </w:tcPr>
-          <w:p/>
-        </w:tc>
-      </w:tr>
-      <w:tr>
         <w:trPr>
           <w:cantSplit/>
         </w:trPr>
@@ -490,22 +540,9 @@
               <w:spacing w:before="0" w:after="0"/>
             </w:pPr>
             <w:r>
-              <w:t>+++IMAGE getImage($row.leftPhoto)+++</w:t>
-            </w:r>
-          </w:p>
-          <w:p>
-            <w:pPr>
-              <w:jc w:val="center"/>
-              <w:spacing w:before="0" w:after="80" w:line="200" w:lineRule="auto"/>
-            </w:pPr>
-            <w:r>
-              <w:rPr>
-                <w:sz w:val="18"/>
-              </w:rPr>
-              <w:t>+++$row.leftPhoto.captionDisplay+++</w:t>
-            </w:r>
-          </w:p>
-          <w:p/>
+              <w:t xml:space="preserve">+++IMAGE getImage($set.doublePhotos[0])+++</w:t>
+            </w:r>
+          </w:p>
         </w:tc>
         <w:tc>
           <w:tcPr>
@@ -518,32 +555,152 @@
               <w:spacing w:before="0" w:after="0"/>
             </w:pPr>
             <w:r>
-              <w:t>+++IMAGE getImage($row.rightPhoto)+++</w:t>
-            </w:r>
-          </w:p>
-          <w:p>
-            <w:pPr>
-              <w:jc w:val="center"/>
-              <w:spacing w:before="0" w:after="80" w:line="200" w:lineRule="auto"/>
-            </w:pPr>
-            <w:r>
-              <w:rPr>
-                <w:sz w:val="18"/>
-              </w:rPr>
-              <w:t>+++$row.rightPhoto.captionDisplay+++</w:t>
-            </w:r>
-          </w:p>
-          <w:p/>
-        </w:tc>
-      </w:tr>
+              <w:t xml:space="preserve">+++IMAGE getImage($set.doublePhotos[1])+++</w:t>
+            </w:r>
+          </w:p>
+        </w:tc>
+      </w:tr>
+    </w:tbl>
+    <w:p>
+      <w:r>
+        <w:t xml:space="preserve">+++$set.captionDisplay+++</w:t>
+      </w:r>
+    </w:p>
+    <w:p>
+      <w:r>
+        <w:t xml:space="preserve">+++END-IF+++</w:t>
+      </w:r>
+    </w:p>
+    <w:p>
+      <w:r>
+        <w:t xml:space="preserve">+++IF $set.isTriple+++</w:t>
+      </w:r>
+    </w:p>
+    <w:tbl>
+      <w:tblPr>
+        <w:tblW w:w="8600" w:type="dxa"/>
+        <w:tblLayout w:type="fixed"/>
+        <w:tblCellMar>
+          <w:top w:w="60" w:type="dxa"/>
+          <w:left w:w="60" w:type="dxa"/>
+          <w:bottom w:w="60" w:type="dxa"/>
+          <w:right w:w="60" w:type="dxa"/>
+        </w:tblCellMar>
+        <w:tblBorders>
+          <w:top w:val="nil"/>
+          <w:left w:val="nil"/>
+          <w:bottom w:val="nil"/>
+          <w:right w:val="nil"/>
+          <w:insideH w:val="nil"/>
+          <w:insideV w:val="nil"/>
+        </w:tblBorders>
+      </w:tblPr>
+      <w:tblGrid>
+        <w:gridCol w:w="2867"/>
+        <w:gridCol w:w="2867"/>
+        <w:gridCol w:w="2866"/>
+      </w:tblGrid>
+      <w:tr>
+        <w:trPr>
+          <w:cantSplit/>
+        </w:trPr>
+        <w:tc>
+          <w:tcPr>
+            <w:tcW w:w="2867" w:type="dxa"/>
+            <w:vAlign w:val="top"/>
+          </w:tcPr>
+          <w:p>
+            <w:pPr>
+              <w:jc w:val="center"/>
+              <w:spacing w:before="0" w:after="0"/>
+            </w:pPr>
+            <w:r>
+              <w:t xml:space="preserve">+++IMAGE getImage($set.triplePhotos[0])+++</w:t>
+            </w:r>
+          </w:p>
+        </w:tc>
+        <w:tc>
+          <w:tcPr>
+            <w:tcW w:w="2867" w:type="dxa"/>
+            <w:vAlign w:val="top"/>
+          </w:tcPr>
+          <w:p>
+            <w:pPr>
+              <w:jc w:val="center"/>
+              <w:spacing w:before="0" w:after="0"/>
+            </w:pPr>
+            <w:r>
+              <w:t xml:space="preserve">+++IMAGE getImage($set.triplePhotos[1])+++</w:t>
+            </w:r>
+          </w:p>
+        </w:tc>
+        <w:tc>
+          <w:tcPr>
+            <w:tcW w:w="2866" w:type="dxa"/>
+            <w:vAlign w:val="top"/>
+          </w:tcPr>
+          <w:p>
+            <w:pPr>
+              <w:jc w:val="center"/>
+              <w:spacing w:before="0" w:after="0"/>
+            </w:pPr>
+            <w:r>
+              <w:t xml:space="preserve">+++IMAGE getImage($set.triplePhotos[2])+++</w:t>
+            </w:r>
+          </w:p>
+        </w:tc>
+      </w:tr>
+    </w:tbl>
+    <w:p>
+      <w:r>
+        <w:t xml:space="preserve">+++$set.captionDisplay+++</w:t>
+      </w:r>
+    </w:p>
+    <w:p>
+      <w:r>
+        <w:t xml:space="preserve">+++END-IF+++</w:t>
+      </w:r>
+    </w:p>
+    <w:p>
+      <w:r>
+        <w:t xml:space="preserve">+++IF $set.isGrid+++</w:t>
+      </w:r>
+    </w:p>
+    <w:tbl>
+      <w:tblPr>
+        <w:tblW w:w="8600" w:type="dxa"/>
+        <w:tblLayout w:type="fixed"/>
+        <w:tblCellMar>
+          <w:top w:w="60" w:type="dxa"/>
+          <w:left w:w="60" w:type="dxa"/>
+          <w:bottom w:w="60" w:type="dxa"/>
+          <w:right w:w="60" w:type="dxa"/>
+        </w:tblCellMar>
+        <w:tblBorders>
+          <w:top w:val="nil"/>
+          <w:left w:val="nil"/>
+          <w:bottom w:val="nil"/>
+          <w:right w:val="nil"/>
+          <w:insideH w:val="nil"/>
+          <w:insideV w:val="nil"/>
+        </w:tblBorders>
+      </w:tblPr>
+      <w:tblGrid>
+        <w:gridCol w:w="4300"/>
+        <w:gridCol w:w="4300"/>
+      </w:tblGrid>
       <w:tr>
         <w:tc>
           <w:tcPr>
             <w:tcW w:w="4300" w:type="dxa"/>
           </w:tcPr>
           <w:p>
-            <w:r>
-              <w:t>+++END-FOR row+++</w:t>
+            <w:pPr>
+              <w:jc w:val="center"/>
+              <w:spacing w:before="0" w:after="0"/>
+            </w:pPr>
+            <w:r>
+              <w:t xml:space="preserve">+++FOR row IN $set.gridRows+++</w:t>
             </w:r>
           </w:p>
         </w:tc>
@@ -551,10 +708,116 @@
           <w:tcPr>
             <w:tcW w:w="4300" w:type="dxa"/>
           </w:tcPr>
-          <w:p/>
+          <w:p>
+            <w:pPr>
+              <w:jc w:val="center"/>
+              <w:spacing w:before="0" w:after="0"/>
+            </w:pPr>
+            <w:r>
+              <w:t xml:space="preserve"/>
+            </w:r>
+          </w:p>
+        </w:tc>
+      </w:tr>
+      <w:tr>
+        <w:trPr>
+          <w:cantSplit/>
+        </w:trPr>
+        <w:tc>
+          <w:tcPr>
+            <w:tcW w:w="4300" w:type="dxa"/>
+            <w:vAlign w:val="top"/>
+          </w:tcPr>
+          <w:p>
+            <w:pPr>
+              <w:jc w:val="center"/>
+              <w:spacing w:before="0" w:after="0"/>
+            </w:pPr>
+            <w:r>
+              <w:t xml:space="preserve">+++IMAGE getImage($row.leftPhoto)+++</w:t>
+            </w:r>
+          </w:p>
+        </w:tc>
+        <w:tc>
+          <w:tcPr>
+            <w:tcW w:w="4300" w:type="dxa"/>
+            <w:vAlign w:val="top"/>
+          </w:tcPr>
+          <w:p>
+            <w:pPr>
+              <w:jc w:val="center"/>
+              <w:spacing w:before="0" w:after="0"/>
+            </w:pPr>
+            <w:r>
+              <w:t xml:space="preserve">+++IF !$row.rightPhoto.isPlaceholder+++</w:t>
+            </w:r>
+          </w:p>
+          <w:p>
+            <w:pPr>
+              <w:jc w:val="center"/>
+              <w:spacing w:before="0" w:after="0"/>
+            </w:pPr>
+            <w:r>
+              <w:t xml:space="preserve">+++IMAGE getImage($row.rightPhoto)+++</w:t>
+            </w:r>
+          </w:p>
+          <w:p>
+            <w:pPr>
+              <w:jc w:val="center"/>
+              <w:spacing w:before="0" w:after="0"/>
+            </w:pPr>
+            <w:r>
+              <w:t xml:space="preserve">+++END-IF+++</w:t>
+            </w:r>
+          </w:p>
+        </w:tc>
+      </w:tr>
+      <w:tr>
+        <w:tc>
+          <w:tcPr>
+            <w:tcW w:w="4300" w:type="dxa"/>
+          </w:tcPr>
+          <w:p>
+            <w:pPr>
+              <w:jc w:val="center"/>
+              <w:spacing w:before="0" w:after="0"/>
+            </w:pPr>
+            <w:r>
+              <w:t xml:space="preserve">+++END-FOR row+++</w:t>
+            </w:r>
+          </w:p>
+        </w:tc>
+        <w:tc>
+          <w:tcPr>
+            <w:tcW w:w="4300" w:type="dxa"/>
+          </w:tcPr>
+          <w:p>
+            <w:pPr>
+              <w:jc w:val="center"/>
+              <w:spacing w:before="0" w:after="0"/>
+            </w:pPr>
+            <w:r>
+              <w:t xml:space="preserve"/>
+            </w:r>
+          </w:p>
         </w:tc>
       </w:tr>
     </w:tbl>
+    <w:p>
+      <w:r>
+        <w:t xml:space="preserve">+++$set.captionDisplay+++</w:t>
+      </w:r>
+    </w:p>
+    <w:p>
+      <w:r>
+        <w:t xml:space="preserve">+++END-IF+++</w:t>
+      </w:r>
+    </w:p>
+    <w:p>
+      <w:r>
+        <w:t xml:space="preserve">+++END-FOR set+++</w:t>
+      </w:r>
+    </w:p>
     <w:p>
       <w:r>
         <w:t>+++END-FOR group+++</w:t>

</xml_diff>